<commit_message>
Deploy preview for PR 392 🛫
</commit_message>
<xml_diff>
--- a/pr-preview/pr-392/vignettes/articles/version-crosswalk-1.3-to-1.4.docx
+++ b/pr-preview/pr-392/vignettes/articles/version-crosswalk-1.3-to-1.4.docx
@@ -1699,70 +1699,70 @@
         <w:rPr>
           <w:rStyle w:val="VerbatimChar"/>
         </w:rPr>
-        <w:t xml:space="preserve">#&gt;     age id    antigen_iso  value</w:t>
-      </w:r>
-      <w:r>
-        <w:br/>
-      </w:r>
-      <w:r>
-        <w:rPr>
-          <w:rStyle w:val="VerbatimChar"/>
-        </w:rPr>
-        <w:t xml:space="preserve">#&gt;   &lt;dbl&gt; &lt;chr&gt; &lt;chr&gt;        &lt;dbl&gt;</w:t>
-      </w:r>
-      <w:r>
-        <w:br/>
-      </w:r>
-      <w:r>
-        <w:rPr>
-          <w:rStyle w:val="VerbatimChar"/>
-        </w:rPr>
-        <w:t xml:space="preserve">#&gt; 1 12.6  1     HlyE_IgA     0.743</w:t>
-      </w:r>
-      <w:r>
-        <w:br/>
-      </w:r>
-      <w:r>
-        <w:rPr>
-          <w:rStyle w:val="VerbatimChar"/>
-        </w:rPr>
-        <w:t xml:space="preserve">#&gt; 2 12.6  1     HlyE_IgG     4.77 </w:t>
-      </w:r>
-      <w:r>
-        <w:br/>
-      </w:r>
-      <w:r>
-        <w:rPr>
-          <w:rStyle w:val="VerbatimChar"/>
-        </w:rPr>
-        <w:t xml:space="preserve">#&gt; 3 16.3  2     HlyE_IgA     1.38 </w:t>
-      </w:r>
-      <w:r>
-        <w:br/>
-      </w:r>
-      <w:r>
-        <w:rPr>
-          <w:rStyle w:val="VerbatimChar"/>
-        </w:rPr>
-        <w:t xml:space="preserve">#&gt; 4 16.3  2     HlyE_IgG     1.71 </w:t>
-      </w:r>
-      <w:r>
-        <w:br/>
-      </w:r>
-      <w:r>
-        <w:rPr>
-          <w:rStyle w:val="VerbatimChar"/>
-        </w:rPr>
-        <w:t xml:space="preserve">#&gt; 5  5.28 3     HlyE_IgA     0.704</w:t>
-      </w:r>
-      <w:r>
-        <w:br/>
-      </w:r>
-      <w:r>
-        <w:rPr>
-          <w:rStyle w:val="VerbatimChar"/>
-        </w:rPr>
-        <w:t xml:space="preserve">#&gt; 6  5.28 3     HlyE_IgG    11.5</w:t>
+        <w:t xml:space="preserve">#&gt;     age id    antigen_iso value</w:t>
+      </w:r>
+      <w:r>
+        <w:br/>
+      </w:r>
+      <w:r>
+        <w:rPr>
+          <w:rStyle w:val="VerbatimChar"/>
+        </w:rPr>
+        <w:t xml:space="preserve">#&gt;   &lt;dbl&gt; &lt;chr&gt; &lt;chr&gt;       &lt;dbl&gt;</w:t>
+      </w:r>
+      <w:r>
+        <w:br/>
+      </w:r>
+      <w:r>
+        <w:rPr>
+          <w:rStyle w:val="VerbatimChar"/>
+        </w:rPr>
+        <w:t xml:space="preserve">#&gt; 1  7.2  1     HlyE_IgA    0.772</w:t>
+      </w:r>
+      <w:r>
+        <w:br/>
+      </w:r>
+      <w:r>
+        <w:rPr>
+          <w:rStyle w:val="VerbatimChar"/>
+        </w:rPr>
+        <w:t xml:space="preserve">#&gt; 2  7.2  1     HlyE_IgG    0.480</w:t>
+      </w:r>
+      <w:r>
+        <w:br/>
+      </w:r>
+      <w:r>
+        <w:rPr>
+          <w:rStyle w:val="VerbatimChar"/>
+        </w:rPr>
+        <w:t xml:space="preserve">#&gt; 3  9.47 2     HlyE_IgA    1.61 </w:t>
+      </w:r>
+      <w:r>
+        <w:br/>
+      </w:r>
+      <w:r>
+        <w:rPr>
+          <w:rStyle w:val="VerbatimChar"/>
+        </w:rPr>
+        <w:t xml:space="preserve">#&gt; 4  9.47 2     HlyE_IgG    2.61 </w:t>
+      </w:r>
+      <w:r>
+        <w:br/>
+      </w:r>
+      <w:r>
+        <w:rPr>
+          <w:rStyle w:val="VerbatimChar"/>
+        </w:rPr>
+        <w:t xml:space="preserve">#&gt; 5 13.9  3     HlyE_IgA    0.595</w:t>
+      </w:r>
+      <w:r>
+        <w:br/>
+      </w:r>
+      <w:r>
+        <w:rPr>
+          <w:rStyle w:val="VerbatimChar"/>
+        </w:rPr>
+        <w:t xml:space="preserve">#&gt; 6 13.9  3     HlyE_IgG    1.41</w:t>
       </w:r>
       <w:r>
         <w:br/>

</xml_diff>